<commit_message>
fix: resolve ambiguous legal expressions across all legal documents
Contract v2 (DOCX):
- Art.11-2§1: "原則として甲が負担" → "甲が負担" (remove escape clause)
- Art.11-2§3: "速やかに提出" → "7営業日以内に提出"
- Art.11-2§6: "合理的な調査" → "14日以内に調査"
- Art.11-2§7: "適切な措置" → specific fraud prevention measures
- Art.6§2: "速やかに更新" → "3営業日以内に更新"
- Art.15§3: "合理的な期間内に使用停止" → "30日以内に使用停止"
- Art.21: "速やかに通知" → "14日以内に通知"
- Art.24§1: "相当期間の催告" → "14日以上の催告"

Enduser terms:
- Art.10§4: "原則として関与しない" → "関与しない"
- Art.12§3: "通知を行うよう努める" → "通知を行う"

Privacy policy:
- Art.6: "速やかに削除" → "30日以内に削除"
- Art.9§2: "可能な限り除外" → specific PII types excluded

Refund policy:
- Art.4§2: "原則として対応できない" → "対応しない"
- Art.10§2: "必要に応じて" → "紛争の内容を確認の上"

Point terms:
- Art.4§3: "通知を行うよう努める" → "30日前までに通知を行う"

Co-Authored-By: Claude Opus 4.6 (1M context) <noreply@anthropic.com>
</commit_message>
<xml_diff>
--- a/docs/legal/aiden-contract-client-v2.docx
+++ b/docs/legal/aiden-contract-client-v2.docx
@@ -936,7 +936,7 @@
           <szCs val="22"/>
           <rtl val="0"/>
         </rPr>
-        <t xml:space="preserve">2. 甲は、メニュー情報に変更が生じた場合、速やかに管理画面を通じて更新しなければならない。</t>
+        <t xml:space="preserve">2. 甲は、メニュー情報に変更が生じた場合、変更を知った日から3営業日以内に管理画面を通じて更新しなければならない。</t>
       </r>
       <r>
         <rPr>
@@ -1683,7 +1683,7 @@
           <szCs val="22"/>
           <rtl val="0"/>
         </rPr>
-        <t xml:space="preserve">1. エンドユーザーまたはカード発行会社がチャージバック（支払異議申立て）を行い、決済代行業者（Stripe）がこれを受理した場合（以下「チャージバック」という。）、当該チャージバックに係る費用（返金額、決済代行業者が課すチャージバック手数料その他関連費用を含む。以下「チャージバック費用」という。）は、原則として甲が負担する。</t>
+        <t xml:space="preserve">1. エンドユーザーまたはカード発行会社がチャージバック（支払異議申立て）を行い、決済代行業者（Stripe）がこれを受理した場合（以下「チャージバック」という。）、当該チャージバックに係る費用（返金額、決済代行業者が課すチャージバック手数料その他関連費用を含む。以下「チャージバック費用」という。）は、甲が負担する。</t>
       </r>
     </p>
     <p>
@@ -1715,7 +1715,7 @@
           <szCs val="22"/>
           <rtl val="0"/>
         </rPr>
-        <t xml:space="preserve">3. 甲は、チャージバックの原因となった取引について、乙の求めに応じ、取引の正当性を証明する資料（配達記録、注文確認、エンドユーザーとのやり取り等）を速やかに提出しなければならない。</t>
+        <t xml:space="preserve">3. 甲は、チャージバックの原因となった取引について、乙の求めに応じ、取引の正当性を証明する資料（配達記録、注文確認、エンドユーザーとのやり取り等）を乙からの資料提出要請の受領後7営業日以内に提出しなければならない。</t>
       </r>
     </p>
     <p>
@@ -1763,7 +1763,7 @@
           <szCs val="22"/>
           <rtl val="0"/>
         </rPr>
-        <t xml:space="preserve">6. 前項の異議申立てがあった場合、乙は合理的な調査を行い、甲に帰責事由がないと認めた場合には、乙がチャージバック費用（チャージバック手数料を除く。）を負担する。ただし、同一店舗において3ヶ月間に3件以上のチャージバックが発生した場合、乙は第4件目以降のチャージバック費用について本項を適用しないことができる。</t>
+        <t xml:space="preserve">6. 前項の異議申立てがあった場合、乙は異議申立ての受領後14日以内に調査を行い、甲に帰責事由がないと認めた場合には、乙がチャージバック費用（チャージバック手数料を除く。）を負担する。ただし、同一店舗において3ヶ月間に3件以上のチャージバックが発生した場合、乙は第4件目以降のチャージバック費用について本項を適用しないことができる。</t>
       </r>
     </p>
     <p>
@@ -1779,7 +1779,7 @@
           <szCs val="22"/>
           <rtl val="0"/>
         </rPr>
-        <t xml:space="preserve">7. 甲は、チャージバックの防止に努め、不正利用が疑われる注文に対して適切な措置を講じなければならない。</t>
+        <t xml:space="preserve">7. 甲は、チャージバックの防止に努め、不正利用が疑われる注文に対して注文確認、本人確認の実施その他の不正防止措置を講じなければならない。</t>
       </r>
     </p>
     <p rsidR="00000000" rsidDel="00000000" rsidP="00000000" rsidRDefault="00000000" rsidRPr="00000000">
@@ -2219,7 +2219,7 @@
           <szCs val="22"/>
           <rtl val="0"/>
         </rPr>
-        <t xml:space="preserve">3. 甲の素材に関する知的財産権は甲に帰属する。本契約の終了時、乙は合理的な期間内に甲の素材の使用を停止する。</t>
+        <t xml:space="preserve">3. 甲の素材に関する知的財産権は甲に帰属する。本契約の終了時、乙は30日以内に甲の素材の使用を停止する。</t>
       </r>
       <r>
         <rPr>
@@ -2855,7 +2855,7 @@
           <szCs val="22"/>
           <rtl val="0"/>
         </rPr>
-        <t xml:space="preserve">甲は、以下の各号に掲げる事由が生じた場合、速やかに乙に書面で通知しなければならない。</t>
+        <t xml:space="preserve">甲は、以下の各号に掲げる事由が生じた場合、当該事由の発生を知った日から14日以内に乙に書面で通知しなければならない。</t>
       </r>
       <r>
         <rPr>
@@ -3173,7 +3173,7 @@
           <szCs val="22"/>
           <rtl val="0"/>
         </rPr>
-        <t xml:space="preserve">(1) 本契約に違反し、相当期間を定めた催告後も是正しない場合</t>
+        <t xml:space="preserve">(1) 本契約に違反し、14日以上の期間を定めた催告後も是正しない場合</t>
       </r>
       <r>
         <rPr>

</xml_diff>

<commit_message>
fix: resolve medium-risk ambiguous expressions in legal documents
Contract v2 (DOCX):
- Art.7§3: define "正当な理由" with examples (staffing, ingredients, equipment)
- Art.19§1: upgrade insurance from best-effort to mandatory obligation
- Art.29§1: limit scope of unilateral changes (exclude fee rate changes)
- Art.24§5: add examples for termination criteria (credit deterioration, sanctions)

POC special terms:
- Art.5§2: define "重大な契約違反" (7+ day payment outage, data breach, 30+ day service failure)

Privacy policy:
- Art.7§3: specify disclosure request fee (¥1,000/request incl. tax)

Refund policy:
- Art.2§2: add examples for "著しく異なる" (wrong item, ingredient mismatch, quantity error)

Co-Authored-By: Claude Opus 4.6 (1M context) <noreply@anthropic.com>
</commit_message>
<xml_diff>
--- a/docs/legal/aiden-contract-client-v2.docx
+++ b/docs/legal/aiden-contract-client-v2.docx
@@ -1042,7 +1042,7 @@
           <szCs val="22"/>
           <rtl val="0"/>
         </rPr>
-        <t xml:space="preserve">3. 甲が正当な理由なく注文を拒否し、またはキャンセルした場合、乙は甲に対し改善を求めることができ、改善がなされない場合は本契約を解除できるものとする。</t>
+        <t xml:space="preserve">3. 甲が正当な理由（人員不足、食材切れ、設備故障等のやむを得ない事由をいう。）なく注文を拒否し、またはキャンセルした場合、乙は甲に対し改善を求めることができ、改善がなされない場合は本契約を解除できるものとする。</t>
       </r>
       <r>
         <rPr>
@@ -2580,7 +2580,7 @@
           <szCs val="22"/>
           <rtl val="0"/>
         </rPr>
-        <t xml:space="preserve">1. 甲は、本契約の有効期間中、以下の保険に加入し、またはこれと同等の賠償能力を維持するよう努めなければならない。</t>
+        <t xml:space="preserve">1. 甲は、本契約の有効期間中、以下の保険に加入し、またはこれと同等の賠償能力を維持しなければならない。</t>
       </r>
       <r>
         <rPr>
@@ -3257,7 +3257,7 @@
           <szCs val="22"/>
           <rtl val="0"/>
         </rPr>
-        <t xml:space="preserve">(5) その他、本契約の継続が困難であると乙が判断した場合</t>
+        <t xml:space="preserve">(5) その他、甲の信用状態の著しい悪化、行政処分の発令等により本契約の継続が困難であると乙が判断した場合</t>
       </r>
       <r>
         <rPr>
@@ -3703,7 +3703,7 @@
           <szCs val="22"/>
           <rtl val="0"/>
         </rPr>
-        <t xml:space="preserve">1. 乙は、本契約に付随するサービス仕様書、ヘルプドキュメント、ポリシー等を合理的な範囲で変更できるものとする。</t>
+        <t xml:space="preserve">1. 乙は、本契約に付随するサービス仕様書、ヘルプドキュメント、ポリシー等を変更できるものとする。ただし、手数料率の変更および甲の権利を実質的に制限する変更を除く。</t>
       </r>
       <r>
         <rPr>

</xml_diff>